<commit_message>
updated new template added hours worked and local storage
</commit_message>
<xml_diff>
--- a/public/template-frontpage.docx
+++ b/public/template-frontpage.docx
@@ -2259,7 +2259,6 @@
     <w:p>
       <w:pPr>
         <w:pStyle w:val="BodyText"/>
-        <w:ind w:left="720"/>
         <w:jc w:val="both"/>
         <w:rPr>
           <w:rFonts w:ascii="Times New Roman" w:hAnsi="Times New Roman" w:cs="Times New Roman"/>
@@ -3528,15 +3527,25 @@
         <w:jc w:val="both"/>
         <w:rPr>
           <w:rFonts w:ascii="Times New Roman" w:eastAsia="Times New Roman" w:hAnsi="Times New Roman" w:cs="Times New Roman"/>
-          <w:kern w:val="0"/>
-          <w:lang w:val="en-US"/>
-          <w14:ligatures w14:val="none"/>
-        </w:rPr>
-      </w:pPr>
-      <w:r>
-        <w:rPr>
-          <w:rFonts w:ascii="Times New Roman" w:eastAsia="Times New Roman" w:hAnsi="Times New Roman" w:cs="Times New Roman"/>
-          <w:kern w:val="0"/>
+          <w:b/>
+          <w:bCs/>
+          <w:kern w:val="0"/>
+          <w:sz w:val="28"/>
+          <w:szCs w:val="28"/>
+          <w:u w:val="single"/>
+          <w:lang w:val="en-US"/>
+          <w14:ligatures w14:val="none"/>
+        </w:rPr>
+      </w:pPr>
+      <w:r>
+        <w:rPr>
+          <w:rFonts w:ascii="Times New Roman" w:eastAsia="Times New Roman" w:hAnsi="Times New Roman" w:cs="Times New Roman"/>
+          <w:b/>
+          <w:bCs/>
+          <w:kern w:val="0"/>
+          <w:sz w:val="28"/>
+          <w:szCs w:val="28"/>
+          <w:u w:val="single"/>
           <w:lang w:val="en-US"/>
           <w14:ligatures w14:val="none"/>
         </w:rPr>
@@ -3546,7 +3555,12 @@
       <w:r>
         <w:rPr>
           <w:rFonts w:ascii="Times New Roman" w:eastAsia="Times New Roman" w:hAnsi="Times New Roman" w:cs="Times New Roman"/>
-          <w:kern w:val="0"/>
+          <w:b/>
+          <w:bCs/>
+          <w:kern w:val="0"/>
+          <w:sz w:val="28"/>
+          <w:szCs w:val="28"/>
+          <w:u w:val="single"/>
           <w:lang w:val="en-US"/>
           <w14:ligatures w14:val="none"/>
         </w:rPr>
@@ -3556,7 +3570,12 @@
       <w:r>
         <w:rPr>
           <w:rFonts w:ascii="Times New Roman" w:eastAsia="Times New Roman" w:hAnsi="Times New Roman" w:cs="Times New Roman"/>
-          <w:kern w:val="0"/>
+          <w:b/>
+          <w:bCs/>
+          <w:kern w:val="0"/>
+          <w:sz w:val="28"/>
+          <w:szCs w:val="28"/>
+          <w:u w:val="single"/>
           <w:lang w:val="en-US"/>
           <w14:ligatures w14:val="none"/>
         </w:rPr>
@@ -3619,14 +3638,18 @@
         <w:spacing w:after="0" w:line="240" w:lineRule="auto"/>
         <w:rPr>
           <w:rFonts w:ascii="Times New Roman" w:eastAsia="Times New Roman" w:hAnsi="Times New Roman" w:cs="Times New Roman"/>
-          <w:kern w:val="0"/>
-          <w:lang w:val="en-US"/>
-          <w14:ligatures w14:val="none"/>
-        </w:rPr>
-      </w:pPr>
-      <w:r>
-        <w:rPr>
-          <w:rFonts w:ascii="Times New Roman" w:eastAsia="Times New Roman" w:hAnsi="Times New Roman" w:cs="Times New Roman"/>
+          <w:b/>
+          <w:bCs/>
+          <w:kern w:val="0"/>
+          <w:lang w:val="en-US"/>
+          <w14:ligatures w14:val="none"/>
+        </w:rPr>
+      </w:pPr>
+      <w:r>
+        <w:rPr>
+          <w:rFonts w:ascii="Times New Roman" w:eastAsia="Times New Roman" w:hAnsi="Times New Roman" w:cs="Times New Roman"/>
+          <w:b/>
+          <w:bCs/>
           <w:kern w:val="0"/>
           <w:lang w:val="en-US"/>
           <w14:ligatures w14:val="none"/>
@@ -3637,6 +3660,8 @@
       <w:r>
         <w:rPr>
           <w:rFonts w:ascii="Times New Roman" w:eastAsia="Times New Roman" w:hAnsi="Times New Roman" w:cs="Times New Roman"/>
+          <w:b/>
+          <w:bCs/>
           <w:kern w:val="0"/>
           <w:lang w:val="en-US"/>
           <w14:ligatures w14:val="none"/>
@@ -3647,6 +3672,8 @@
       <w:r>
         <w:rPr>
           <w:rFonts w:ascii="Times New Roman" w:eastAsia="Times New Roman" w:hAnsi="Times New Roman" w:cs="Times New Roman"/>
+          <w:b/>
+          <w:bCs/>
           <w:kern w:val="0"/>
           <w:lang w:val="en-US"/>
           <w14:ligatures w14:val="none"/>
@@ -3673,11 +3700,22 @@
       <w:r>
         <w:rPr>
           <w:rFonts w:ascii="Times New Roman" w:eastAsia="Times New Roman" w:hAnsi="Times New Roman" w:cs="Times New Roman"/>
-          <w:kern w:val="0"/>
-          <w:lang w:val="en-US"/>
-          <w14:ligatures w14:val="none"/>
-        </w:rPr>
-        <w:t>Date: {date}</w:t>
+          <w:b/>
+          <w:bCs/>
+          <w:kern w:val="0"/>
+          <w:lang w:val="en-US"/>
+          <w14:ligatures w14:val="none"/>
+        </w:rPr>
+        <w:t>Date:</w:t>
+      </w:r>
+      <w:r>
+        <w:rPr>
+          <w:rFonts w:ascii="Times New Roman" w:eastAsia="Times New Roman" w:hAnsi="Times New Roman" w:cs="Times New Roman"/>
+          <w:kern w:val="0"/>
+          <w:lang w:val="en-US"/>
+          <w14:ligatures w14:val="none"/>
+        </w:rPr>
+        <w:t xml:space="preserve"> {date}</w:t>
       </w:r>
     </w:p>
     <w:p>
@@ -3699,11 +3737,22 @@
       <w:r>
         <w:rPr>
           <w:rFonts w:ascii="Times New Roman" w:eastAsia="Times New Roman" w:hAnsi="Times New Roman" w:cs="Times New Roman"/>
-          <w:kern w:val="0"/>
-          <w:lang w:val="en-US"/>
-          <w14:ligatures w14:val="none"/>
-        </w:rPr>
-        <w:t>Hours Worked: {hours}</w:t>
+          <w:b/>
+          <w:bCs/>
+          <w:kern w:val="0"/>
+          <w:lang w:val="en-US"/>
+          <w14:ligatures w14:val="none"/>
+        </w:rPr>
+        <w:t>Hours Worked:</w:t>
+      </w:r>
+      <w:r>
+        <w:rPr>
+          <w:rFonts w:ascii="Times New Roman" w:eastAsia="Times New Roman" w:hAnsi="Times New Roman" w:cs="Times New Roman"/>
+          <w:kern w:val="0"/>
+          <w:lang w:val="en-US"/>
+          <w14:ligatures w14:val="none"/>
+        </w:rPr>
+        <w:t xml:space="preserve"> {hours}</w:t>
       </w:r>
     </w:p>
     <w:p>
@@ -3735,14 +3784,18 @@
         <w:spacing w:after="0" w:line="240" w:lineRule="auto"/>
         <w:rPr>
           <w:rFonts w:ascii="Times New Roman" w:eastAsia="Times New Roman" w:hAnsi="Times New Roman" w:cs="Times New Roman"/>
-          <w:kern w:val="0"/>
-          <w:lang w:val="en-US"/>
-          <w14:ligatures w14:val="none"/>
-        </w:rPr>
-      </w:pPr>
-      <w:r>
-        <w:rPr>
-          <w:rFonts w:ascii="Times New Roman" w:eastAsia="Times New Roman" w:hAnsi="Times New Roman" w:cs="Times New Roman"/>
+          <w:b/>
+          <w:bCs/>
+          <w:kern w:val="0"/>
+          <w:lang w:val="en-US"/>
+          <w14:ligatures w14:val="none"/>
+        </w:rPr>
+      </w:pPr>
+      <w:r>
+        <w:rPr>
+          <w:rFonts w:ascii="Times New Roman" w:eastAsia="Times New Roman" w:hAnsi="Times New Roman" w:cs="Times New Roman"/>
+          <w:b/>
+          <w:bCs/>
           <w:kern w:val="0"/>
           <w:lang w:val="en-US"/>
           <w14:ligatures w14:val="none"/>
@@ -3806,14 +3859,20 @@
         <w:spacing w:after="0" w:line="240" w:lineRule="auto"/>
         <w:rPr>
           <w:rFonts w:ascii="Times New Roman" w:eastAsia="Times New Roman" w:hAnsi="Times New Roman" w:cs="Times New Roman"/>
-          <w:kern w:val="0"/>
-          <w:lang w:val="en-US"/>
-          <w14:ligatures w14:val="none"/>
-        </w:rPr>
-      </w:pPr>
-      <w:r>
-        <w:rPr>
-          <w:rFonts w:ascii="Times New Roman" w:eastAsia="Times New Roman" w:hAnsi="Times New Roman" w:cs="Times New Roman"/>
+          <w:b/>
+          <w:bCs/>
+          <w:color w:val="0F4761" w:themeColor="accent1" w:themeShade="BF"/>
+          <w:kern w:val="0"/>
+          <w:lang w:val="en-US"/>
+          <w14:ligatures w14:val="none"/>
+        </w:rPr>
+      </w:pPr>
+      <w:r>
+        <w:rPr>
+          <w:rFonts w:ascii="Times New Roman" w:eastAsia="Times New Roman" w:hAnsi="Times New Roman" w:cs="Times New Roman"/>
+          <w:b/>
+          <w:bCs/>
+          <w:color w:val="0F4761" w:themeColor="accent1" w:themeShade="BF"/>
           <w:kern w:val="0"/>
           <w:lang w:val="en-US"/>
           <w14:ligatures w14:val="none"/>
@@ -3876,14 +3935,20 @@
         <w:spacing w:after="0" w:line="240" w:lineRule="auto"/>
         <w:rPr>
           <w:rFonts w:ascii="Times New Roman" w:eastAsia="Times New Roman" w:hAnsi="Times New Roman" w:cs="Times New Roman"/>
-          <w:kern w:val="0"/>
-          <w:lang w:val="en-US"/>
-          <w14:ligatures w14:val="none"/>
-        </w:rPr>
-      </w:pPr>
-      <w:r>
-        <w:rPr>
-          <w:rFonts w:ascii="Times New Roman" w:eastAsia="Times New Roman" w:hAnsi="Times New Roman" w:cs="Times New Roman"/>
+          <w:b/>
+          <w:bCs/>
+          <w:color w:val="0A2F41" w:themeColor="accent1" w:themeShade="80"/>
+          <w:kern w:val="0"/>
+          <w:lang w:val="en-US"/>
+          <w14:ligatures w14:val="none"/>
+        </w:rPr>
+      </w:pPr>
+      <w:r>
+        <w:rPr>
+          <w:rFonts w:ascii="Times New Roman" w:eastAsia="Times New Roman" w:hAnsi="Times New Roman" w:cs="Times New Roman"/>
+          <w:b/>
+          <w:bCs/>
+          <w:color w:val="0F4761" w:themeColor="accent1" w:themeShade="BF"/>
           <w:kern w:val="0"/>
           <w:lang w:val="en-US"/>
           <w14:ligatures w14:val="none"/>
@@ -4674,6 +4739,7 @@
   <w:style w:type="character" w:default="1" w:styleId="DefaultParagraphFont">
     <w:name w:val="Default Paragraph Font"/>
     <w:uiPriority w:val="1"/>
+    <w:semiHidden/>
     <w:unhideWhenUsed/>
   </w:style>
   <w:style w:type="table" w:default="1" w:styleId="TableNormal">

</xml_diff>

<commit_message>
updated new template with line spacing
</commit_message>
<xml_diff>
--- a/public/template-frontpage.docx
+++ b/public/template-frontpage.docx
@@ -2927,7 +2927,7 @@
         <w:widowControl w:val="0"/>
         <w:autoSpaceDE w:val="0"/>
         <w:autoSpaceDN w:val="0"/>
-        <w:spacing w:after="0" w:line="240" w:lineRule="auto"/>
+        <w:spacing w:after="0" w:line="360" w:lineRule="auto"/>
         <w:ind w:firstLine="720"/>
         <w:jc w:val="both"/>
         <w:rPr>
@@ -3227,7 +3227,7 @@
         <w:widowControl w:val="0"/>
         <w:autoSpaceDE w:val="0"/>
         <w:autoSpaceDN w:val="0"/>
-        <w:spacing w:after="0" w:line="240" w:lineRule="auto"/>
+        <w:spacing w:after="0" w:line="360" w:lineRule="auto"/>
         <w:ind w:firstLine="720"/>
         <w:jc w:val="both"/>
         <w:rPr>

</xml_diff>

<commit_message>
updated new template just changed padding of frontend
</commit_message>
<xml_diff>
--- a/public/template-frontpage.docx
+++ b/public/template-frontpage.docx
@@ -2770,6 +2770,12 @@
         </w:rPr>
         <w:t>{abstract}</w:t>
       </w:r>
+      <w:r>
+        <w:rPr>
+          <w:rFonts w:ascii="Times New Roman" w:hAnsi="Times New Roman" w:cs="Times New Roman"/>
+        </w:rPr>
+        <w:tab/>
+      </w:r>
     </w:p>
     <w:p>
       <w:pPr>
@@ -2777,18 +2783,6 @@
         <w:jc w:val="both"/>
         <w:rPr>
           <w:rFonts w:ascii="Times New Roman" w:hAnsi="Times New Roman" w:cs="Times New Roman"/>
-        </w:rPr>
-      </w:pPr>
-    </w:p>
-    <w:p>
-      <w:pPr>
-        <w:rPr>
-          <w:rFonts w:ascii="Times New Roman" w:hAnsi="Times New Roman" w:cs="Times New Roman"/>
-          <w:b/>
-          <w:bCs/>
-          <w:sz w:val="28"/>
-          <w:szCs w:val="28"/>
-          <w:u w:val="single"/>
         </w:rPr>
       </w:pPr>
     </w:p>
@@ -2949,6 +2943,17 @@
           <w14:ligatures w14:val="none"/>
         </w:rPr>
         <w:t>{introduction}</w:t>
+      </w:r>
+      <w:r>
+        <w:rPr>
+          <w:rFonts w:ascii="Times New Roman" w:eastAsia="Times New Roman" w:hAnsi="Times New Roman" w:cs="Times New Roman"/>
+          <w:bCs/>
+          <w:kern w:val="0"/>
+          <w:szCs w:val="22"/>
+          <w:lang w:val="en-US"/>
+          <w14:ligatures w14:val="none"/>
+        </w:rPr>
+        <w:tab/>
       </w:r>
     </w:p>
     <w:p>
@@ -3273,6 +3278,17 @@
           <w14:ligatures w14:val="none"/>
         </w:rPr>
         <w:t>}</w:t>
+      </w:r>
+      <w:r>
+        <w:rPr>
+          <w:rFonts w:ascii="Times New Roman" w:eastAsia="Times New Roman" w:hAnsi="Times New Roman" w:cs="Times New Roman"/>
+          <w:bCs/>
+          <w:kern w:val="0"/>
+          <w:szCs w:val="22"/>
+          <w:lang w:val="en-US"/>
+          <w14:ligatures w14:val="none"/>
+        </w:rPr>
+        <w:tab/>
       </w:r>
     </w:p>
     <w:p>
@@ -4739,7 +4755,6 @@
   <w:style w:type="character" w:default="1" w:styleId="DefaultParagraphFont">
     <w:name w:val="Default Paragraph Font"/>
     <w:uiPriority w:val="1"/>
-    <w:semiHidden/>
     <w:unhideWhenUsed/>
   </w:style>
   <w:style w:type="table" w:default="1" w:styleId="TableNormal">

</xml_diff>